<commit_message>
docs: correct student name to Zhukov Mykhailo Volodymyrovych
</commit_message>
<xml_diff>
--- a/Лабораторна_робота_3_Жуков_Михайло.docx
+++ b/Лабораторна_робота_3_Жуков_Михайло.docx
@@ -264,9 +264,7 @@
       </w:r>
     </w:p>
     <w:p>
-      <w:r>
-        <w:br w:type="page"/>
-      </w:r>
+      <w:r/>
     </w:p>
     <w:p>
       <w:pPr>
@@ -4705,40 +4703,7 @@
           <w:b w:val="0"/>
         </w:rPr>
       </w:r>
-      <w:r>
-        <w:drawing>
-          <wp:inline xmlns:a="http://schemas.openxmlformats.org/drawingml/2006/main" xmlns:pic="http://schemas.openxmlformats.org/drawingml/2006/picture">
-            <wp:extent cx="5940000" cy="1836000"/>
-            <wp:docPr id="1" name="Picture 1"/>
-            <wp:cNvGraphicFramePr>
-              <a:graphicFrameLocks noChangeAspect="1"/>
-            </wp:cNvGraphicFramePr>
-            <a:graphic>
-              <a:graphicData uri="http://schemas.openxmlformats.org/drawingml/2006/picture">
-                <pic:pic>
-                  <pic:nvPicPr>
-                    <pic:cNvPr id="0" name="coverage.png"/>
-                    <pic:cNvPicPr/>
-                  </pic:nvPicPr>
-                  <pic:blipFill>
-                    <a:blip r:embed="rId9"/>
-                    <a:stretch>
-                      <a:fillRect/>
-                    </a:stretch>
-                  </pic:blipFill>
-                  <pic:spPr>
-                    <a:xfrm>
-                      <a:off x="0" y="0"/>
-                      <a:ext cx="5940000" cy="1836000"/>
-                    </a:xfrm>
-                    <a:prstGeom prst="rect"/>
-                  </pic:spPr>
-                </pic:pic>
-              </a:graphicData>
-            </a:graphic>
-          </wp:inline>
-        </w:drawing>
-      </w:r>
+      <w:r/>
     </w:p>
     <w:p>
       <w:pPr>
@@ -6150,7 +6115,7 @@
         <w:rPr>
           <w:b w:val="0"/>
         </w:rPr>
-        <w:t>Повідомлення комітів залишено в оригінальному вигляді. У локальному репозиторії для навчальних комітів використано ім’я Жуков Михайло Володимирович та технічну адресу lab3@localhost; ця адреса не є контактною електронною поштою.</w:t>
+        <w:t>Повідомлення комітів залишено в оригінальному вигляді. Для комітів у локальному репозиторії встановлено ім’я Жуков Михайло Володимирович та технічну адресу lab3@localhost; ця адреса не є контактною електронною поштою.</w:t>
       </w:r>
     </w:p>
     <w:p>

</xml_diff>